<commit_message>
Napraw błędne przypisanie cytowania [9]->[10] w podrozdziale 2.2
Pełny audyt bibliografii (30 pozycji, 69 wystąpień w tekście) wykazał, że
zdanie o ekstruzji łąkotki i wzroście docisku tkankowego >40% cytowało
pracę Mesfar/Shirazi-Adl [9] (obciążenia mięśnia czworogłowego), podczas
gdy dokładnie ten wynik (>40% wzrost docisku w przedziale przyśrodkowym
przy ekstruzji łąkotki) pochodzi z pracy Liu i wsp. 2024 [10]. Zweryfikowano
treść obu prac przed poprawką. Po korekcie: 0 cytowań-widm, 0 nieużywanych
pozycji bibliografii, pełna zgodność numeracji 1-30.
</commit_message>
<xml_diff>
--- a/output/Praca_magisterska_Klapczynski_BIBLIOGRAFIA_1-3-11.docx
+++ b/output/Praca_magisterska_Klapczynski_BIBLIOGRAFIA_1-3-11.docx
@@ -3764,7 +3764,45 @@
           <w:vertAlign w:val="baseline"/>
           <w:rtl w:val="0"/>
         </w:rPr>
-        <w:t xml:space="preserve"> ruch ten warunkowany jest synergistyczną pracą prostowników i zginaczy, w tym mięśni półbłoniastego, półścięgnistego i dwugłowego uda, wspieranych przez mięsień podkolanowy. Kluczową rolę w rozpraszaniu obciążeń odgrywają łąkotki. Ich dysfunkcja (np. pęknięcia promieniowe lub postępująca ekstruzja) drastycznie zaburza pole kontaktu stawowego i może zwiększać szczytowy docisk tkankowy w przedziale przyśrodkowym o ponad 40%, przyspieszając procesy degeneracyjne chrząstki [9]. Ze względu na kombinację dużego zakresu ruchu, wysokich obciążeń dynamicznych i ograniczonej zdolności regeneracyjnej struktur chrzęstno-więzadłowych, staw kolanowy pozostaje jedną z najbardziej podatnych na poważne urazy struktur w piłce nożnej.</w:t>
+        <w:t xml:space="preserve"> ruch ten warunkowany jest synergistyczną pracą prostowników i zginaczy, w tym mięśni półbłoniastego, półścięgnistego i dwugłowego uda, wspieranych przez mięsień podkolanowy. Kluczową rolę w rozpraszaniu obciążeń odgrywają łąkotki. Ich dysfunkcja (np. pęknięcia promieniowe lub postępująca ekstruzja) drastycznie zaburza pole kontaktu stawowego i </w:t>
+      </w:r>
+      <w:r>
+        <w:rPr>
+          <w:rFonts w:ascii="Times New Roman" w:cs="Times New Roman" w:eastAsia="Times New Roman" w:hAnsi="Times New Roman"/>
+          <w:b w:val="0"/>
+          <w:bCs w:val="0"/>
+          <w:i w:val="0"/>
+          <w:iCs w:val="0"/>
+          <w:smallCaps w:val="0"/>
+          <w:strike w:val="0"/>
+          <w:color w:val="000000"/>
+          <w:sz w:val="24"/>
+          <w:szCs w:val="24"/>
+          <w:u w:val="none"/>
+          <w:shd w:fill="auto" w:val="clear"/>
+          <w:vertAlign w:val="baseline"/>
+          <w:rtl w:val="0"/>
+        </w:rPr>
+        <w:t xml:space="preserve">może zwiększać szczytowy docisk tkankowy w przedziale przyśrodkowym o ponad 40%, przyspieszając procesy degeneracyjne chrząstki [10].</w:t>
+      </w:r>
+      <w:r>
+        <w:rPr>
+          <w:rFonts w:ascii="Times New Roman" w:cs="Times New Roman" w:eastAsia="Times New Roman" w:hAnsi="Times New Roman"/>
+          <w:b w:val="0"/>
+          <w:bCs w:val="0"/>
+          <w:i w:val="0"/>
+          <w:iCs w:val="0"/>
+          <w:smallCaps w:val="0"/>
+          <w:strike w:val="0"/>
+          <w:color w:val="000000"/>
+          <w:sz w:val="24"/>
+          <w:szCs w:val="24"/>
+          <w:u w:val="none"/>
+          <w:shd w:fill="auto" w:val="clear"/>
+          <w:vertAlign w:val="baseline"/>
+          <w:rtl w:val="0"/>
+        </w:rPr>
+        <w:t xml:space="preserve"> Ze względu na kombinację dużego zakresu ruchu, wysokich obciążeń dynamicznych i ograniczonej zdolności regeneracyjnej struktur chrzęstno-więzadłowych, staw kolanowy pozostaje jedną z najbardziej podatnych na poważne urazy struktur w piłce nożnej.</w:t>
       </w:r>
     </w:p>
     <w:bookmarkStart w:colFirst="0" w:colLast="0" w:name="p168j4no1o92" w:id="14"/>

</xml_diff>